<commit_message>
ERD: tandai foreign key dengan garis bawah titik-titik; perbarui dokumen
</commit_message>
<xml_diff>
--- a/dokumen/01_DOKUMEN_RANCANGAN.docx
+++ b/dokumen/01_DOKUMEN_RANCANGAN.docx
@@ -1527,13 +1527,6 @@
       <w:pPr>
         <w:spacing w:after="160"/>
         <w:jc w:val="center"/>
-        <w:sectPr>
-          <w:footerReference w:type="default" r:id="rId7"/>
-          <w:pgSz w:w="16838" w:h="11906" w:orient="landscape"/>
-          <w:pgMar w:top="1134" w:right="1134" w:bottom="1134" w:left="1134" w:header="708" w:footer="708" w:gutter="0"/>
-          <w:pgNumType/>
-          <w:docGrid w:linePitch="360"/>
-        </w:sectPr>
       </w:pPr>
       <w:r>
         <w:rPr>
@@ -1544,6 +1537,40 @@
           <w:szCs w:val="18"/>
         </w:rPr>
         <w:t xml:space="preserve">Gambar 1. Entity Relationship Diagram</w:t>
+      </w:r>
+    </w:p>
+    <w:p>
+      <w:pPr>
+        <w:sectPr>
+          <w:footerReference w:type="default" r:id="rId7"/>
+          <w:pgSz w:w="16838" w:h="11906" w:orient="landscape"/>
+          <w:pgMar w:top="1134" w:right="1134" w:bottom="1134" w:left="1134" w:header="708" w:footer="708" w:gutter="0"/>
+          <w:pgNumType/>
+          <w:docGrid w:linePitch="360"/>
+        </w:sectPr>
+      </w:pPr>
+      <w:r>
+        <w:t xml:space="preserve">Keterangan simbol: persegi = entitas, elips = atribut, belah ketupat = relasi, 1 / N = kardinalitas. Atribut bergaris bawah penuh = </w:t>
+      </w:r>
+      <w:r>
+        <w:rPr>
+          <w:b/>
+          <w:bCs/>
+        </w:rPr>
+        <w:t xml:space="preserve">primary key</w:t>
+      </w:r>
+      <w:r>
+        <w:t xml:space="preserve">; atribut bergaris bawah titik-titik = </w:t>
+      </w:r>
+      <w:r>
+        <w:rPr>
+          <w:b/>
+          <w:bCs/>
+        </w:rPr>
+        <w:t xml:space="preserve">foreign key</w:t>
+      </w:r>
+      <w:r>
+        <w:t xml:space="preserve">.</w:t>
       </w:r>
     </w:p>
     <w:p>

</xml_diff>